<commit_message>
docs(P1+P2): 报告/README/PPT 数字同步 + 问答预演稿(17题)
</commit_message>
<xml_diff>
--- a/report/专业综合工程实践设计报告.docx
+++ b/report/专业综合工程实践设计报告.docx
@@ -3169,7 +3169,7 @@
           <w:color w:val="000000"/>
           <w:sz w:val="24"/>
         </w:rPr>
-        <w:t>单次检索端到端延迟（Reranker OFF）P50 = 51.6ms；开启 Reranker 后 P50 = 1362.92ms，其中 Reranker 占比约 90%（已通过超时降级 + Top-K 截断优化降至 ≤ 900ms）。并发吞吐：单并发 0.52 qps，4 并发 0.76 qps，8 并发 0.80 qps。BM25 倒排索引全量重建 402 chunks 用时 52.93ms，增量更新单 chunk 7.54ms（200 chunks 0.37ms）。</w:t>
+        <w:t>单次检索端到端延迟（Reranker OFF）P50 = 51.36ms；开启 Reranker 后 P50 = 1486.59ms、P99 = 1631.62ms，Reranker 为绝对瓶颈（占比约 97%）。通过 asyncio.wait_for 超时降级（1.5s 硬超时），P99 长尾较优化前的 3130.82ms 压缩到 1631.62ms（降幅约 48%），避免偶发慢查询拖垮体验；Top-K 截断（rerank_top_k=30）则保证候选增多时精排耗时可控。并发吞吐：单并发 0.33 qps，4 并发 2.03 qps，8 并发 3.51 qps（CrossEncoder 经线程池并行）。BM25 倒排索引全量重建 402 chunks 用时 838.61ms，增量新增 49 chunks 111.73ms、增量删除 2.85ms。</w:t>
       </w:r>
     </w:p>
     <w:p>
@@ -3201,7 +3201,7 @@
           <w:color w:val="000000"/>
           <w:sz w:val="24"/>
         </w:rPr>
-        <w:t>功能测试与端到端测试全部通过。检索层面，完整管线显著优于任一单路检索（top-1 +3.64pt vs BM25-only），查询改写对复杂问题有明显增益（+9.09pt）。生成质量层面，RAGAS 四指标均在 0.6 以上，context_recall 达到 0.84 表明检索覆盖度良好。性能层面，单次检索 P50 延迟可接受，并发吞吐满足中小规模企业知识库需求。pytest 单元与集成测试 65 passed。</w:t>
+        <w:t>功能测试与端到端测试全部通过。检索层面，完整管线显著优于任一单路检索（top-1 +3.64pt vs BM25-only），查询改写对复杂问题有明显增益（+9.09pt）。生成质量层面，RAGAS 四指标均在 0.6 以上，context_recall 达到 0.84 表明检索覆盖度良好。性能层面，单次检索 P50 延迟可接受，并发吞吐满足中小规模企业知识库需求。pytest 单元与集成测试 92 passed。</w:t>
       </w:r>
     </w:p>
     <w:p>
@@ -3255,7 +3255,7 @@
           <w:color w:val="000000"/>
           <w:sz w:val="24"/>
         </w:rPr>
-        <w:t>系统仍存在以下不足：（1）BM25 倒排索引虽已支持跨进程持久化，但单实例重启时仍需从数据库反序列化；（2）Embedding 与 Reranker 在 CPU 上推理，虽已通过工程优化降低延迟，但大批量入库与高并发下吞吐仍受限；（3）评测语料以程序化合成的企业文档为主，真实公开文档占比较小；（4）RAGAS 评测样本规模仍有限。</w:t>
+        <w:t>系统仍存在以下不足：（1）BM25 倒排索引虽已支持跨进程持久化，但单实例重启时仍需从数据库反序列化；（2）Embedding 与 Reranker 在 CPU 上推理，Reranker 精排 P50 约 1.49s 仍为主要瓶颈，已通过超时降级（P99 从 3.13s 压缩到 1.63s）与 Top-K 截断缓解长尾，但大批量入库与高并发下吞吐仍受限；（3）评测语料以程序化合成的企业文档为主，真实公开文档占比较小；（4）RAGAS 评测样本规模仍有限。</w:t>
       </w:r>
     </w:p>
     <w:p>

</xml_diff>